<commit_message>
Add Experiment 7 and OEP 7
</commit_message>
<xml_diff>
--- a/Exp_3/Exp-3.docx
+++ b/Exp_3/Exp-3.docx
@@ -653,6 +653,7 @@
         <w:keepLines w:val="0"/>
         <w:widowControl/>
         <w:numPr>
+          <w:ilvl w:val="0"/>
           <w:numId w:val="0"/>
         </w:numPr>
         <w:suppressLineNumbers w:val="0"/>
@@ -4444,6 +4445,7 @@
         <w:keepLines w:val="0"/>
         <w:widowControl/>
         <w:numPr>
+          <w:ilvl w:val="0"/>
           <w:numId w:val="0"/>
         </w:numPr>
         <w:suppressLineNumbers w:val="0"/>
@@ -4482,6 +4484,7 @@
         <w:keepLines w:val="0"/>
         <w:widowControl/>
         <w:numPr>
+          <w:ilvl w:val="0"/>
           <w:numId w:val="0"/>
         </w:numPr>
         <w:suppressLineNumbers w:val="0"/>
@@ -4648,6 +4651,7 @@
         <w:keepLines w:val="0"/>
         <w:widowControl/>
         <w:numPr>
+          <w:ilvl w:val="0"/>
           <w:numId w:val="0"/>
         </w:numPr>
         <w:suppressLineNumbers w:val="0"/>
@@ -4702,44 +4706,80 @@
         </w:rPr>
         <w:t xml:space="preserve">The cross-correlation and autocorrelation of the given discrete-time signals were successfully simulated using Python. The corresponding correlation sequences were obtained and displayed using stem plots, verifying the similarity between the signals and the self-similarity of the signal. </w:t>
       </w:r>
+    </w:p>
+    <w:p>
+      <w:pPr>
+        <w:pStyle w:val="4"/>
+        <w:keepNext w:val="0"/>
+        <w:keepLines w:val="0"/>
+        <w:widowControl/>
+        <w:suppressLineNumbers w:val="0"/>
+        <w:jc w:val="left"/>
+        <w:rPr>
+          <w:rFonts w:hint="default" w:ascii="Times New Roman" w:hAnsi="Times New Roman" w:cs="Times New Roman"/>
+        </w:rPr>
+      </w:pPr>
+      <w:r>
+        <w:rPr>
+          <w:rFonts w:hint="default" w:ascii="Times New Roman" w:hAnsi="Times New Roman" w:cs="Times New Roman"/>
+        </w:rPr>
+        <w:t>Conclusion</w:t>
+      </w:r>
+    </w:p>
+    <w:p>
+      <w:pPr>
+        <w:pStyle w:val="10"/>
+        <w:keepNext w:val="0"/>
+        <w:keepLines w:val="0"/>
+        <w:widowControl/>
+        <w:suppressLineNumbers w:val="0"/>
+      </w:pPr>
+      <w:r>
+        <w:rPr>
+          <w:rFonts w:hint="default" w:ascii="Times New Roman" w:hAnsi="Times New Roman" w:eastAsia="SimSun" w:cs="Times New Roman"/>
+        </w:rPr>
+        <w:t>The experiment was performed successfully to simulate cross-correlation and autocorrelation on discrete-time signals. It was observed that cross-correlation measures the similarity between two different signals, while autocorrelation measures the similarity of a signal with itself. The generated plots clearly demonstrated these properties, confirming the correct implementation of the correlation functions in Python.</w:t>
+      </w:r>
+      <w:r>
+        <w:t xml:space="preserve"> </w:t>
+      </w:r>
+    </w:p>
+    <w:p>
+      <w:pPr>
+        <w:pStyle w:val="10"/>
+        <w:keepNext w:val="0"/>
+        <w:keepLines w:val="0"/>
+        <w:widowControl/>
+        <w:suppressLineNumbers w:val="0"/>
+      </w:pPr>
+    </w:p>
+    <w:p>
+      <w:pPr>
+        <w:pStyle w:val="10"/>
+        <w:keepNext w:val="0"/>
+        <w:keepLines w:val="0"/>
+        <w:widowControl/>
+        <w:suppressLineNumbers w:val="0"/>
+        <w:rPr>
+          <w:rFonts w:hint="default"/>
+          <w:lang w:val="en-IN"/>
+        </w:rPr>
+      </w:pPr>
+      <w:r>
+        <w:rPr>
+          <w:rFonts w:hint="default"/>
+          <w:lang w:val="en-IN"/>
+        </w:rPr>
+        <w:t xml:space="preserve">Github: </w:t>
+      </w:r>
       <w:bookmarkStart w:id="0" w:name="_GoBack"/>
       <w:bookmarkEnd w:id="0"/>
-    </w:p>
-    <w:p>
-      <w:pPr>
-        <w:pStyle w:val="4"/>
-        <w:keepNext w:val="0"/>
-        <w:keepLines w:val="0"/>
-        <w:widowControl/>
-        <w:suppressLineNumbers w:val="0"/>
-        <w:jc w:val="left"/>
-        <w:rPr>
-          <w:rFonts w:hint="default" w:ascii="Times New Roman" w:hAnsi="Times New Roman" w:cs="Times New Roman"/>
-        </w:rPr>
-      </w:pPr>
-      <w:r>
-        <w:rPr>
-          <w:rFonts w:hint="default" w:ascii="Times New Roman" w:hAnsi="Times New Roman" w:cs="Times New Roman"/>
-        </w:rPr>
-        <w:t>Conclusion</w:t>
-      </w:r>
-    </w:p>
-    <w:p>
-      <w:pPr>
-        <w:pStyle w:val="10"/>
-        <w:keepNext w:val="0"/>
-        <w:keepLines w:val="0"/>
-        <w:widowControl/>
-        <w:suppressLineNumbers w:val="0"/>
-      </w:pPr>
-      <w:r>
-        <w:rPr>
-          <w:rFonts w:hint="default" w:ascii="Times New Roman" w:hAnsi="Times New Roman" w:eastAsia="SimSun" w:cs="Times New Roman"/>
-        </w:rPr>
-        <w:t>The experiment was performed successfully to simulate cross-correlation and autocorrelation on discrete-time signals. It was observed that cross-correlation measures the similarity between two different signals, while autocorrelation measures the similarity of a signal with itself. The generated plots clearly demonstrated these properties, confirming the correct implementation of the correlation functions in Python.</w:t>
-      </w:r>
-      <w:r>
-        <w:t xml:space="preserve"> </w:t>
+      <w:r>
+        <w:rPr>
+          <w:rFonts w:hint="default"/>
+          <w:lang w:val="en-IN"/>
+        </w:rPr>
+        <w:t>https://github.com/Shiv07dev/DSIP_Lab_Manual/tree/main/Exp_3</w:t>
       </w:r>
     </w:p>
     <w:p>
@@ -4748,6 +4788,7 @@
         <w:keepLines w:val="0"/>
         <w:widowControl/>
         <w:numPr>
+          <w:ilvl w:val="0"/>
           <w:numId w:val="0"/>
         </w:numPr>
         <w:suppressLineNumbers w:val="0"/>
@@ -4904,6 +4945,12 @@
           <w:insideH w:val="single" w:color="000000" w:sz="4" w:space="0"/>
           <w:insideV w:val="single" w:color="000000" w:sz="4" w:space="0"/>
         </w:tblBorders>
+        <w:tblCellMar>
+          <w:top w:w="0" w:type="dxa"/>
+          <w:left w:w="0" w:type="dxa"/>
+          <w:bottom w:w="0" w:type="dxa"/>
+          <w:right w:w="0" w:type="dxa"/>
+        </w:tblCellMar>
       </w:tblPrEx>
       <w:trPr>
         <w:trHeight w:val="1398" w:hRule="atLeast"/>
@@ -6068,7 +6115,7 @@
     <w:lsdException w:unhideWhenUsed="0" w:uiPriority="0" w:semiHidden="0" w:name="Document Map"/>
     <w:lsdException w:unhideWhenUsed="0" w:uiPriority="0" w:semiHidden="0" w:name="Plain Text"/>
     <w:lsdException w:unhideWhenUsed="0" w:uiPriority="0" w:semiHidden="0" w:name="E-mail Signature"/>
-    <w:lsdException w:unhideWhenUsed="0" w:uiPriority="0" w:semiHidden="0" w:name="Normal (Web)"/>
+    <w:lsdException w:qFormat="1" w:unhideWhenUsed="0" w:uiPriority="0" w:semiHidden="0" w:name="Normal (Web)"/>
     <w:lsdException w:unhideWhenUsed="0" w:uiPriority="0" w:semiHidden="0" w:name="HTML Acronym"/>
     <w:lsdException w:unhideWhenUsed="0" w:uiPriority="0" w:semiHidden="0" w:name="HTML Address"/>
     <w:lsdException w:unhideWhenUsed="0" w:uiPriority="0" w:semiHidden="0" w:name="HTML Cite"/>
@@ -6376,6 +6423,7 @@
   </w:style>
   <w:style w:type="paragraph" w:styleId="10">
     <w:name w:val="Normal (Web)"/>
+    <w:qFormat/>
     <w:uiPriority w:val="0"/>
     <w:pPr>
       <w:spacing w:before="0" w:beforeAutospacing="1" w:after="0" w:afterAutospacing="1"/>
@@ -6383,6 +6431,7 @@
       <w:jc w:val="left"/>
     </w:pPr>
     <w:rPr>
+      <w:rFonts w:ascii="Times New Roman" w:hAnsi="Times New Roman" w:eastAsia="SimSun" w:cs="Times New Roman"/>
       <w:kern w:val="0"/>
       <w:sz w:val="24"/>
       <w:szCs w:val="24"/>

</xml_diff>